<commit_message>
Add Etsy Checkout A/B Test project and fix contact form email handling
</commit_message>
<xml_diff>
--- a/master_cv.docx
+++ b/master_cv.docx
@@ -30,7 +30,7 @@
           <w:sz w:val="23"/>
           <w:szCs w:val="23"/>
         </w:rPr>
-        <w:t>DATA ANALYST — MASTER CV</w:t>
+        <w:t xml:space="preserve">DATA ANALYST </w:t>
       </w:r>
     </w:p>
     <w:p>
@@ -44,79 +44,7 @@
           <w:sz w:val="18"/>
           <w:szCs w:val="18"/>
         </w:rPr>
-        <w:t xml:space="preserve">Sheffield, S1 4NQ, United </w:t>
-      </w:r>
-      <w:proofErr w:type="gramStart"/>
-      <w:r>
-        <w:rPr>
-          <w:color w:val="444444"/>
-          <w:sz w:val="18"/>
-          <w:szCs w:val="18"/>
-        </w:rPr>
-        <w:t>Kingdom  |</w:t>
-      </w:r>
-      <w:proofErr w:type="gramEnd"/>
-      <w:r>
-        <w:rPr>
-          <w:color w:val="444444"/>
-          <w:sz w:val="18"/>
-          <w:szCs w:val="18"/>
-        </w:rPr>
-        <w:t xml:space="preserve">  </w:t>
-      </w:r>
-      <w:proofErr w:type="gramStart"/>
-      <w:r>
-        <w:rPr>
-          <w:color w:val="444444"/>
-          <w:sz w:val="18"/>
-          <w:szCs w:val="18"/>
-        </w:rPr>
-        <w:t>07352678358  |</w:t>
-      </w:r>
-      <w:proofErr w:type="gramEnd"/>
-      <w:r>
-        <w:rPr>
-          <w:color w:val="444444"/>
-          <w:sz w:val="18"/>
-          <w:szCs w:val="18"/>
-        </w:rPr>
-        <w:t xml:space="preserve">  </w:t>
-      </w:r>
-      <w:proofErr w:type="gramStart"/>
-      <w:r>
-        <w:rPr>
-          <w:color w:val="444444"/>
-          <w:sz w:val="18"/>
-          <w:szCs w:val="18"/>
-        </w:rPr>
-        <w:t>kirthisabari561@gmail.com  |</w:t>
-      </w:r>
-      <w:proofErr w:type="gramEnd"/>
-      <w:r>
-        <w:rPr>
-          <w:color w:val="444444"/>
-          <w:sz w:val="18"/>
-          <w:szCs w:val="18"/>
-        </w:rPr>
-        <w:t xml:space="preserve">  linkedin.com/in/kirthisabari</w:t>
-      </w:r>
-      <w:proofErr w:type="gramStart"/>
-      <w:r>
-        <w:rPr>
-          <w:color w:val="444444"/>
-          <w:sz w:val="18"/>
-          <w:szCs w:val="18"/>
-        </w:rPr>
-        <w:t>25  |</w:t>
-      </w:r>
-      <w:proofErr w:type="gramEnd"/>
-      <w:r>
-        <w:rPr>
-          <w:color w:val="444444"/>
-          <w:sz w:val="18"/>
-          <w:szCs w:val="18"/>
-        </w:rPr>
-        <w:t xml:space="preserve">  github.com/kirthisabari25</w:t>
+        <w:t>Sheffield, S1 4NQ, United Kingdom  |  07352678358  |  kirthisabari561@gmail.com  |  linkedin.com/in/kirthisabari25  |  github.com/kirthisabari25</w:t>
       </w:r>
     </w:p>
     <w:p>
@@ -148,55 +76,7 @@
           <w:sz w:val="21"/>
           <w:szCs w:val="21"/>
         </w:rPr>
-        <w:t xml:space="preserve">MSc Data Science student at the University of Sheffield with hands-on experience in SQL, Python, Power BI, Tableau, KNIME, </w:t>
-      </w:r>
-      <w:proofErr w:type="spellStart"/>
-      <w:r>
-        <w:rPr>
-          <w:sz w:val="21"/>
-          <w:szCs w:val="21"/>
-        </w:rPr>
-        <w:t>PySpark</w:t>
-      </w:r>
-      <w:proofErr w:type="spellEnd"/>
-      <w:r>
-        <w:rPr>
-          <w:sz w:val="21"/>
-          <w:szCs w:val="21"/>
-        </w:rPr>
-        <w:t xml:space="preserve">/Databricks, and Excel. Completed industry data-analytics simulations with Deloitte, British Airways, and Lloyds Banking Group, building and communicating data-driven insights. Holds the </w:t>
-      </w:r>
-      <w:proofErr w:type="spellStart"/>
-      <w:r>
-        <w:rPr>
-          <w:sz w:val="21"/>
-          <w:szCs w:val="21"/>
-        </w:rPr>
-        <w:t>DataCamp</w:t>
-      </w:r>
-      <w:proofErr w:type="spellEnd"/>
-      <w:r>
-        <w:rPr>
-          <w:sz w:val="21"/>
-          <w:szCs w:val="21"/>
-        </w:rPr>
-        <w:t xml:space="preserve"> Associate Data Analyst in SQL certification, the </w:t>
-      </w:r>
-      <w:proofErr w:type="spellStart"/>
-      <w:r>
-        <w:rPr>
-          <w:sz w:val="21"/>
-          <w:szCs w:val="21"/>
-        </w:rPr>
-        <w:t>DataCamp</w:t>
-      </w:r>
-      <w:proofErr w:type="spellEnd"/>
-      <w:r>
-        <w:rPr>
-          <w:sz w:val="21"/>
-          <w:szCs w:val="21"/>
-        </w:rPr>
-        <w:t xml:space="preserve"> Data Analyst in Power BI career track (50 hrs), and three KNIME certifications. Strong track record of translating messy, multi-source data into validated findings and clear recommendations for both technical and non-technical stakeholders.</w:t>
+        <w:t>MSc Data Science student at the University of Sheffield with hands-on experience in SQL, Python, Power BI, Tableau, KNIME, PySpark/Databricks, and Excel. Completed industry data-analytics simulations with Deloitte, British Airways, and Lloyds Banking Group, building and communicating data-driven insights. Holds the DataCamp Associate Data Analyst in SQL certification, the DataCamp Data Analyst in Power BI career track (50 hrs), and three KNIME certifications. Strong track record of translating messy, multi-source data into validated findings and clear recommendations for both technical and non-technical stakeholders.</w:t>
       </w:r>
     </w:p>
     <w:p>
@@ -257,53 +137,21 @@
           <w:sz w:val="21"/>
           <w:szCs w:val="21"/>
         </w:rPr>
-        <w:t xml:space="preserve">-  Data Engineering: </w:t>
-      </w:r>
-      <w:proofErr w:type="spellStart"/>
-      <w:r>
-        <w:rPr>
-          <w:sz w:val="21"/>
-          <w:szCs w:val="21"/>
-        </w:rPr>
-        <w:t>PySpark</w:t>
-      </w:r>
-      <w:proofErr w:type="spellEnd"/>
-      <w:r>
-        <w:rPr>
-          <w:sz w:val="21"/>
-          <w:szCs w:val="21"/>
-        </w:rPr>
-        <w:t>, Databricks</w:t>
-      </w:r>
-    </w:p>
-    <w:p>
-      <w:pPr>
-        <w:spacing w:after="80"/>
-        <w:ind w:left="360" w:hanging="180"/>
-        <w:jc w:val="both"/>
-      </w:pPr>
-      <w:r>
-        <w:rPr>
-          <w:sz w:val="21"/>
-          <w:szCs w:val="21"/>
-        </w:rPr>
-        <w:t xml:space="preserve">-  Machine Learning: Classification, Regression (Random Forest, </w:t>
-      </w:r>
-      <w:proofErr w:type="spellStart"/>
-      <w:r>
-        <w:rPr>
-          <w:sz w:val="21"/>
-          <w:szCs w:val="21"/>
-        </w:rPr>
-        <w:t>XGBoost</w:t>
-      </w:r>
-      <w:proofErr w:type="spellEnd"/>
-      <w:r>
-        <w:rPr>
-          <w:sz w:val="21"/>
-          <w:szCs w:val="21"/>
-        </w:rPr>
-        <w:t>), Anomaly Detection, Deep Learning (CNNs, Autoencoders), Computer Vision (YOLOv5, OpenCV), scikit-learn, Cross-Validation &amp; Feature Engineering</w:t>
+        <w:t>-  Data Engineering: PySpark, Databricks</w:t>
+      </w:r>
+    </w:p>
+    <w:p>
+      <w:pPr>
+        <w:spacing w:after="80"/>
+        <w:ind w:left="360" w:hanging="180"/>
+        <w:jc w:val="both"/>
+      </w:pPr>
+      <w:r>
+        <w:rPr>
+          <w:sz w:val="21"/>
+          <w:szCs w:val="21"/>
+        </w:rPr>
+        <w:t>-  Machine Learning: Classification, Regression (Random Forest, XGBoost), Anomaly Detection, Deep Learning (CNNs, Autoencoders), Computer Vision (YOLOv5, OpenCV), scikit-learn, Cross-Validation &amp; Feature Engineering</w:t>
       </w:r>
     </w:p>
     <w:p>
@@ -365,60 +213,128 @@
           <w:sz w:val="21"/>
           <w:szCs w:val="21"/>
         </w:rPr>
-        <w:t xml:space="preserve">Data Analytics Virtual Experience — Deloitte (via </w:t>
-      </w:r>
-      <w:proofErr w:type="gramStart"/>
-      <w:r>
-        <w:rPr>
-          <w:b/>
-          <w:bCs/>
-          <w:sz w:val="21"/>
-          <w:szCs w:val="21"/>
-        </w:rPr>
-        <w:t>Forage)</w:t>
+        <w:t xml:space="preserve">Data Analytics Virtual Experience </w:t>
+      </w:r>
+      <w:r>
+        <w:rPr>
+          <w:b/>
+          <w:bCs/>
+          <w:sz w:val="21"/>
+          <w:szCs w:val="21"/>
+        </w:rPr>
+        <w:t xml:space="preserve">- </w:t>
+      </w:r>
+      <w:r>
+        <w:rPr>
+          <w:b/>
+          <w:bCs/>
+          <w:sz w:val="21"/>
+          <w:szCs w:val="21"/>
+        </w:rPr>
+        <w:t>Deloitte (via Forage)</w:t>
       </w:r>
       <w:r>
         <w:rPr>
           <w:i/>
           <w:iCs/>
         </w:rPr>
-        <w:t xml:space="preserve">   </w:t>
-      </w:r>
-      <w:proofErr w:type="gramEnd"/>
+        <w:t xml:space="preserve">   |   June 2026</w:t>
+      </w:r>
+    </w:p>
+    <w:p>
+      <w:pPr>
+        <w:spacing w:after="80"/>
+        <w:ind w:left="360" w:hanging="180"/>
+        <w:jc w:val="both"/>
+      </w:pPr>
+      <w:r>
+        <w:rPr>
+          <w:sz w:val="21"/>
+          <w:szCs w:val="21"/>
+        </w:rPr>
+        <w:t>-  Analysed real business datasets using forensic technology and data-analysis techniques.</w:t>
+      </w:r>
+    </w:p>
+    <w:p>
+      <w:pPr>
+        <w:spacing w:after="80"/>
+        <w:ind w:left="360" w:hanging="180"/>
+        <w:jc w:val="both"/>
+      </w:pPr>
+      <w:r>
+        <w:rPr>
+          <w:sz w:val="21"/>
+          <w:szCs w:val="21"/>
+        </w:rPr>
+        <w:t>-  Delivered structured findings in the format used by Deloitte data analytics teams.</w:t>
+      </w:r>
+    </w:p>
+    <w:p>
+      <w:pPr>
+        <w:spacing w:before="160" w:after="40"/>
+        <w:jc w:val="both"/>
+      </w:pPr>
+      <w:r>
+        <w:rPr>
+          <w:b/>
+          <w:bCs/>
+          <w:sz w:val="21"/>
+          <w:szCs w:val="21"/>
+        </w:rPr>
+        <w:t xml:space="preserve">Data Science Virtual Experience </w:t>
+      </w:r>
+      <w:r>
+        <w:rPr>
+          <w:b/>
+          <w:bCs/>
+          <w:sz w:val="21"/>
+          <w:szCs w:val="21"/>
+        </w:rPr>
+        <w:t xml:space="preserve">- </w:t>
+      </w:r>
+      <w:r>
+        <w:rPr>
+          <w:b/>
+          <w:bCs/>
+          <w:sz w:val="21"/>
+          <w:szCs w:val="21"/>
+        </w:rPr>
+        <w:t>British Airways (via Forage)</w:t>
+      </w:r>
       <w:r>
         <w:rPr>
           <w:i/>
           <w:iCs/>
         </w:rPr>
-        <w:t>|   June 2026</w:t>
-      </w:r>
-    </w:p>
-    <w:p>
-      <w:pPr>
-        <w:spacing w:after="80"/>
-        <w:ind w:left="360" w:hanging="180"/>
-        <w:jc w:val="both"/>
-      </w:pPr>
-      <w:r>
-        <w:rPr>
-          <w:sz w:val="21"/>
-          <w:szCs w:val="21"/>
-        </w:rPr>
-        <w:t>-  Analysed real business datasets using forensic technology and data-analysis techniques.</w:t>
-      </w:r>
-    </w:p>
-    <w:p>
-      <w:pPr>
-        <w:spacing w:after="80"/>
-        <w:ind w:left="360" w:hanging="180"/>
-        <w:jc w:val="both"/>
-      </w:pPr>
-      <w:r>
-        <w:rPr>
-          <w:sz w:val="21"/>
-          <w:szCs w:val="21"/>
-        </w:rPr>
-        <w:t>-  Delivered structured findings in the format used by Deloitte data analytics teams.</w:t>
+        <w:t xml:space="preserve">   |   May 2026</w:t>
+      </w:r>
+    </w:p>
+    <w:p>
+      <w:pPr>
+        <w:spacing w:after="80"/>
+        <w:ind w:left="360" w:hanging="180"/>
+        <w:jc w:val="both"/>
+      </w:pPr>
+      <w:r>
+        <w:rPr>
+          <w:sz w:val="21"/>
+          <w:szCs w:val="21"/>
+        </w:rPr>
+        <w:t>-  Scraped and analysed customer review data to uncover satisfaction trends.</w:t>
+      </w:r>
+    </w:p>
+    <w:p>
+      <w:pPr>
+        <w:spacing w:after="80"/>
+        <w:ind w:left="360" w:hanging="180"/>
+        <w:jc w:val="both"/>
+      </w:pPr>
+      <w:r>
+        <w:rPr>
+          <w:sz w:val="21"/>
+          <w:szCs w:val="21"/>
+        </w:rPr>
+        <w:t>-  Built a predictive ML model for customer buying behaviour; evaluated using ROC curve, confusion matrix, and feature-importance analysis.</w:t>
       </w:r>
     </w:p>
     <w:p>
@@ -433,60 +349,60 @@
           <w:sz w:val="21"/>
           <w:szCs w:val="21"/>
         </w:rPr>
-        <w:t xml:space="preserve">Data Science Virtual Experience — British Airways (via </w:t>
-      </w:r>
-      <w:proofErr w:type="gramStart"/>
-      <w:r>
-        <w:rPr>
-          <w:b/>
-          <w:bCs/>
-          <w:sz w:val="21"/>
-          <w:szCs w:val="21"/>
-        </w:rPr>
-        <w:t>Forage)</w:t>
+        <w:t xml:space="preserve">Data Science Virtual Experience </w:t>
+      </w:r>
+      <w:r>
+        <w:rPr>
+          <w:b/>
+          <w:bCs/>
+          <w:sz w:val="21"/>
+          <w:szCs w:val="21"/>
+        </w:rPr>
+        <w:t xml:space="preserve">- </w:t>
+      </w:r>
+      <w:r>
+        <w:rPr>
+          <w:b/>
+          <w:bCs/>
+          <w:sz w:val="21"/>
+          <w:szCs w:val="21"/>
+        </w:rPr>
+        <w:t>Lloyds Banking Group (via Forage)</w:t>
       </w:r>
       <w:r>
         <w:rPr>
           <w:i/>
           <w:iCs/>
         </w:rPr>
-        <w:t xml:space="preserve">   </w:t>
-      </w:r>
-      <w:proofErr w:type="gramEnd"/>
-      <w:r>
-        <w:rPr>
-          <w:i/>
-          <w:iCs/>
-        </w:rPr>
-        <w:t>|   May 2026</w:t>
-      </w:r>
-    </w:p>
-    <w:p>
-      <w:pPr>
-        <w:spacing w:after="80"/>
-        <w:ind w:left="360" w:hanging="180"/>
-        <w:jc w:val="both"/>
-      </w:pPr>
-      <w:r>
-        <w:rPr>
-          <w:sz w:val="21"/>
-          <w:szCs w:val="21"/>
-        </w:rPr>
-        <w:t>-  Scraped and analysed customer review data to uncover satisfaction trends.</w:t>
-      </w:r>
-    </w:p>
-    <w:p>
-      <w:pPr>
-        <w:spacing w:after="80"/>
-        <w:ind w:left="360" w:hanging="180"/>
-        <w:jc w:val="both"/>
-      </w:pPr>
-      <w:r>
-        <w:rPr>
-          <w:sz w:val="21"/>
-          <w:szCs w:val="21"/>
-        </w:rPr>
-        <w:t>-  Built a predictive ML model for customer buying behaviour; evaluated using ROC curve, confusion matrix, and feature-importance analysis.</w:t>
+        <w:t xml:space="preserve">   |   May 2026</w:t>
+      </w:r>
+    </w:p>
+    <w:p>
+      <w:pPr>
+        <w:spacing w:after="80"/>
+        <w:ind w:left="360" w:hanging="180"/>
+        <w:jc w:val="both"/>
+      </w:pPr>
+      <w:r>
+        <w:rPr>
+          <w:sz w:val="21"/>
+          <w:szCs w:val="21"/>
+        </w:rPr>
+        <w:t>-  Conducted exploratory data analysis on financial datasets and built a classification model.</w:t>
+      </w:r>
+    </w:p>
+    <w:p>
+      <w:pPr>
+        <w:spacing w:after="80"/>
+        <w:ind w:left="360" w:hanging="180"/>
+        <w:jc w:val="both"/>
+      </w:pPr>
+      <w:r>
+        <w:rPr>
+          <w:sz w:val="21"/>
+          <w:szCs w:val="21"/>
+        </w:rPr>
+        <w:t>-  Interpreted model outputs in a banking business context.</w:t>
       </w:r>
     </w:p>
     <w:p>
@@ -501,95 +417,25 @@
           <w:sz w:val="21"/>
           <w:szCs w:val="21"/>
         </w:rPr>
-        <w:t xml:space="preserve">Data Science Virtual Experience — Lloyds Banking Group (via </w:t>
-      </w:r>
-      <w:proofErr w:type="gramStart"/>
-      <w:r>
-        <w:rPr>
-          <w:b/>
-          <w:bCs/>
-          <w:sz w:val="21"/>
-          <w:szCs w:val="21"/>
-        </w:rPr>
-        <w:t>Forage)</w:t>
-      </w:r>
-      <w:r>
-        <w:rPr>
-          <w:i/>
-          <w:iCs/>
-        </w:rPr>
-        <w:t xml:space="preserve">   </w:t>
-      </w:r>
-      <w:proofErr w:type="gramEnd"/>
-      <w:r>
-        <w:rPr>
-          <w:i/>
-          <w:iCs/>
-        </w:rPr>
-        <w:t>|   May 2026</w:t>
-      </w:r>
-    </w:p>
-    <w:p>
-      <w:pPr>
-        <w:spacing w:after="80"/>
-        <w:ind w:left="360" w:hanging="180"/>
-        <w:jc w:val="both"/>
-      </w:pPr>
-      <w:r>
-        <w:rPr>
-          <w:sz w:val="21"/>
-          <w:szCs w:val="21"/>
-        </w:rPr>
-        <w:t>-  Conducted exploratory data analysis on financial datasets and built a classification model.</w:t>
-      </w:r>
-    </w:p>
-    <w:p>
-      <w:pPr>
-        <w:spacing w:after="80"/>
-        <w:ind w:left="360" w:hanging="180"/>
-        <w:jc w:val="both"/>
-      </w:pPr>
-      <w:r>
-        <w:rPr>
-          <w:sz w:val="21"/>
-          <w:szCs w:val="21"/>
-        </w:rPr>
-        <w:t>-  Interpreted model outputs in a banking business context.</w:t>
-      </w:r>
-    </w:p>
-    <w:p>
-      <w:pPr>
-        <w:spacing w:before="160" w:after="40"/>
-        <w:jc w:val="both"/>
-      </w:pPr>
-      <w:r>
-        <w:rPr>
-          <w:b/>
-          <w:bCs/>
-          <w:sz w:val="21"/>
-          <w:szCs w:val="21"/>
-        </w:rPr>
-        <w:t xml:space="preserve">Web Development Intern — </w:t>
-      </w:r>
-      <w:proofErr w:type="spellStart"/>
-      <w:r>
-        <w:rPr>
-          <w:b/>
-          <w:bCs/>
-          <w:sz w:val="21"/>
-          <w:szCs w:val="21"/>
-        </w:rPr>
-        <w:t>RepuNEXT</w:t>
-      </w:r>
-      <w:proofErr w:type="spellEnd"/>
-      <w:r>
-        <w:rPr>
-          <w:b/>
-          <w:bCs/>
-          <w:sz w:val="21"/>
-          <w:szCs w:val="21"/>
-        </w:rPr>
-        <w:t>, Chennai</w:t>
+        <w:t xml:space="preserve">Web Development Intern </w:t>
+      </w:r>
+      <w:r>
+        <w:rPr>
+          <w:b/>
+          <w:bCs/>
+          <w:sz w:val="21"/>
+          <w:szCs w:val="21"/>
+        </w:rPr>
+        <w:t xml:space="preserve">- </w:t>
+      </w:r>
+      <w:r>
+        <w:rPr>
+          <w:b/>
+          <w:bCs/>
+          <w:sz w:val="21"/>
+          <w:szCs w:val="21"/>
+        </w:rPr>
+        <w:t>RepuNEXT, Chennai</w:t>
       </w:r>
       <w:r>
         <w:rPr>
@@ -643,87 +489,49 @@
           <w:sz w:val="21"/>
           <w:szCs w:val="21"/>
         </w:rPr>
-        <w:t xml:space="preserve">-  MSc Data Science — University of Sheffield, </w:t>
-      </w:r>
-      <w:proofErr w:type="gramStart"/>
-      <w:r>
-        <w:rPr>
-          <w:sz w:val="21"/>
-          <w:szCs w:val="21"/>
-        </w:rPr>
-        <w:t>UK  |</w:t>
-      </w:r>
-      <w:proofErr w:type="gramEnd"/>
-      <w:r>
-        <w:rPr>
-          <w:sz w:val="21"/>
-          <w:szCs w:val="21"/>
-        </w:rPr>
-        <w:t xml:space="preserve">  Sept 2025 - Present</w:t>
-      </w:r>
-    </w:p>
-    <w:p>
-      <w:pPr>
-        <w:spacing w:after="80"/>
-        <w:ind w:left="360" w:hanging="180"/>
-        <w:jc w:val="both"/>
-      </w:pPr>
-      <w:r>
-        <w:rPr>
-          <w:sz w:val="21"/>
-          <w:szCs w:val="21"/>
-        </w:rPr>
-        <w:t xml:space="preserve">-  </w:t>
-      </w:r>
-      <w:proofErr w:type="spellStart"/>
-      <w:proofErr w:type="gramStart"/>
-      <w:r>
-        <w:rPr>
-          <w:sz w:val="21"/>
-          <w:szCs w:val="21"/>
-        </w:rPr>
-        <w:t>B.Tech</w:t>
-      </w:r>
-      <w:proofErr w:type="spellEnd"/>
-      <w:proofErr w:type="gramEnd"/>
-      <w:r>
-        <w:rPr>
-          <w:sz w:val="21"/>
-          <w:szCs w:val="21"/>
-        </w:rPr>
-        <w:t xml:space="preserve"> in Artificial Intelligence and Data Science Engineering — Panimalar Engineering College, </w:t>
-      </w:r>
-      <w:proofErr w:type="gramStart"/>
-      <w:r>
-        <w:rPr>
-          <w:sz w:val="21"/>
-          <w:szCs w:val="21"/>
-        </w:rPr>
-        <w:t>India  |</w:t>
-      </w:r>
-      <w:proofErr w:type="gramEnd"/>
-      <w:r>
-        <w:rPr>
-          <w:sz w:val="21"/>
-          <w:szCs w:val="21"/>
-        </w:rPr>
-        <w:t xml:space="preserve">  May </w:t>
-      </w:r>
-      <w:proofErr w:type="gramStart"/>
-      <w:r>
-        <w:rPr>
-          <w:sz w:val="21"/>
-          <w:szCs w:val="21"/>
-        </w:rPr>
-        <w:t>2025  |</w:t>
-      </w:r>
-      <w:proofErr w:type="gramEnd"/>
-      <w:r>
-        <w:rPr>
-          <w:sz w:val="21"/>
-          <w:szCs w:val="21"/>
-        </w:rPr>
-        <w:t xml:space="preserve">  CGPA: 8.06/10</w:t>
+        <w:t xml:space="preserve">-  MSc Data Science </w:t>
+      </w:r>
+      <w:r>
+        <w:rPr>
+          <w:sz w:val="21"/>
+          <w:szCs w:val="21"/>
+        </w:rPr>
+        <w:t xml:space="preserve">- </w:t>
+      </w:r>
+      <w:r>
+        <w:rPr>
+          <w:sz w:val="21"/>
+          <w:szCs w:val="21"/>
+        </w:rPr>
+        <w:t>University of Sheffield, UK  |  Sept 2025 - Present</w:t>
+      </w:r>
+    </w:p>
+    <w:p>
+      <w:pPr>
+        <w:spacing w:after="80"/>
+        <w:ind w:left="360" w:hanging="180"/>
+        <w:jc w:val="both"/>
+      </w:pPr>
+      <w:r>
+        <w:rPr>
+          <w:sz w:val="21"/>
+          <w:szCs w:val="21"/>
+        </w:rPr>
+        <w:t xml:space="preserve">-  B.Tech in Artificial Intelligence and Data Science Engineering </w:t>
+      </w:r>
+      <w:r>
+        <w:rPr>
+          <w:sz w:val="21"/>
+          <w:szCs w:val="21"/>
+        </w:rPr>
+        <w:t xml:space="preserve">- </w:t>
+      </w:r>
+      <w:r>
+        <w:rPr>
+          <w:sz w:val="21"/>
+          <w:szCs w:val="21"/>
+        </w:rPr>
+        <w:t>Panimalar Engineering College, India  |  May 2025  |  CGPA: 8.06/10</w:t>
       </w:r>
     </w:p>
     <w:p>
@@ -757,37 +565,39 @@
           <w:sz w:val="21"/>
           <w:szCs w:val="21"/>
         </w:rPr>
-        <w:t>Customer Churn Analysis Dashboard — Power BI</w:t>
-      </w:r>
-    </w:p>
-    <w:p>
-      <w:pPr>
-        <w:spacing w:after="80"/>
-        <w:ind w:left="360" w:hanging="180"/>
-        <w:jc w:val="both"/>
-      </w:pPr>
-      <w:r>
-        <w:rPr>
-          <w:sz w:val="21"/>
-          <w:szCs w:val="21"/>
-        </w:rPr>
-        <w:t>-  Analysed a dataset of 6,687 telecom customers (</w:t>
-      </w:r>
-      <w:proofErr w:type="spellStart"/>
-      <w:r>
-        <w:rPr>
-          <w:sz w:val="21"/>
-          <w:szCs w:val="21"/>
-        </w:rPr>
-        <w:t>Databel</w:t>
-      </w:r>
-      <w:proofErr w:type="spellEnd"/>
-      <w:r>
-        <w:rPr>
-          <w:sz w:val="21"/>
-          <w:szCs w:val="21"/>
-        </w:rPr>
-        <w:t>) to identify churn drivers across 6 interactive report pages.</w:t>
+        <w:t xml:space="preserve">Customer Churn Analysis Dashboard </w:t>
+      </w:r>
+      <w:r>
+        <w:rPr>
+          <w:b/>
+          <w:bCs/>
+          <w:sz w:val="21"/>
+          <w:szCs w:val="21"/>
+        </w:rPr>
+        <w:t xml:space="preserve">- </w:t>
+      </w:r>
+      <w:r>
+        <w:rPr>
+          <w:b/>
+          <w:bCs/>
+          <w:sz w:val="21"/>
+          <w:szCs w:val="21"/>
+        </w:rPr>
+        <w:t>Power BI</w:t>
+      </w:r>
+    </w:p>
+    <w:p>
+      <w:pPr>
+        <w:spacing w:after="80"/>
+        <w:ind w:left="360" w:hanging="180"/>
+        <w:jc w:val="both"/>
+      </w:pPr>
+      <w:r>
+        <w:rPr>
+          <w:sz w:val="21"/>
+          <w:szCs w:val="21"/>
+        </w:rPr>
+        <w:t>-  Analysed a dataset of 6,687 telecom customers (Databel) to identify churn drivers across 6 interactive report pages.</w:t>
       </w:r>
     </w:p>
     <w:p>
@@ -816,7 +626,35 @@
           <w:szCs w:val="21"/>
         </w:rPr>
         <w:lastRenderedPageBreak/>
-        <w:t>-  Revealed senior customers churn at 38.46% — highest-risk demographic — enabling targeted retention strategy recommendations.</w:t>
+        <w:t xml:space="preserve">-  Revealed senior customers churn at 38.46% </w:t>
+      </w:r>
+      <w:r>
+        <w:rPr>
+          <w:sz w:val="21"/>
+          <w:szCs w:val="21"/>
+        </w:rPr>
+        <w:t xml:space="preserve">- </w:t>
+      </w:r>
+      <w:r>
+        <w:rPr>
+          <w:sz w:val="21"/>
+          <w:szCs w:val="21"/>
+        </w:rPr>
+        <w:t xml:space="preserve">highest-risk demographic </w:t>
+      </w:r>
+      <w:r>
+        <w:rPr>
+          <w:sz w:val="21"/>
+          <w:szCs w:val="21"/>
+        </w:rPr>
+        <w:t xml:space="preserve">- </w:t>
+      </w:r>
+      <w:r>
+        <w:rPr>
+          <w:sz w:val="21"/>
+          <w:szCs w:val="21"/>
+        </w:rPr>
+        <w:t>enabling targeted retention strategy recommendations.</w:t>
       </w:r>
     </w:p>
     <w:p>
@@ -973,7 +811,25 @@
           <w:sz w:val="21"/>
           <w:szCs w:val="21"/>
         </w:rPr>
-        <w:t>Virtual Reality Fire Rescue Simulation — Offshore Oil Rig</w:t>
+        <w:t xml:space="preserve">Virtual Reality Fire Rescue Simulation </w:t>
+      </w:r>
+      <w:r>
+        <w:rPr>
+          <w:b/>
+          <w:bCs/>
+          <w:sz w:val="21"/>
+          <w:szCs w:val="21"/>
+        </w:rPr>
+        <w:t xml:space="preserve">- </w:t>
+      </w:r>
+      <w:r>
+        <w:rPr>
+          <w:b/>
+          <w:bCs/>
+          <w:sz w:val="21"/>
+          <w:szCs w:val="21"/>
+        </w:rPr>
+        <w:t>Offshore Oil Rig</w:t>
       </w:r>
     </w:p>
     <w:p>
@@ -1201,23 +1057,7 @@
           <w:sz w:val="21"/>
           <w:szCs w:val="21"/>
         </w:rPr>
-        <w:t xml:space="preserve">-  Produced a scalable </w:t>
-      </w:r>
-      <w:proofErr w:type="spellStart"/>
-      <w:r>
-        <w:rPr>
-          <w:sz w:val="21"/>
-          <w:szCs w:val="21"/>
-        </w:rPr>
-        <w:t>PySpark</w:t>
-      </w:r>
-      <w:proofErr w:type="spellEnd"/>
-      <w:r>
-        <w:rPr>
-          <w:sz w:val="21"/>
-          <w:szCs w:val="21"/>
-        </w:rPr>
-        <w:t xml:space="preserve"> analysis of 55,906 ICLR submissions, showing acceptance rates falling from 50.1% in 2017 to 30.5% in 2024, indicating increasing competition.</w:t>
+        <w:t>-  Produced a scalable PySpark analysis of 55,906 ICLR submissions, showing acceptance rates falling from 50.1% in 2017 to 30.5% in 2024, indicating increasing competition.</w:t>
       </w:r>
     </w:p>
     <w:p>
@@ -1318,39 +1158,21 @@
           <w:sz w:val="21"/>
           <w:szCs w:val="21"/>
         </w:rPr>
-        <w:t xml:space="preserve">-  Benchmarked Random Forest against </w:t>
-      </w:r>
-      <w:proofErr w:type="spellStart"/>
-      <w:r>
-        <w:rPr>
-          <w:sz w:val="21"/>
-          <w:szCs w:val="21"/>
-        </w:rPr>
-        <w:t>XGBoost</w:t>
-      </w:r>
-      <w:proofErr w:type="spellEnd"/>
-      <w:r>
-        <w:rPr>
-          <w:sz w:val="21"/>
-          <w:szCs w:val="21"/>
-        </w:rPr>
-        <w:t xml:space="preserve"> using 5-fold cross-validation on 8,000 historical orders; selected </w:t>
-      </w:r>
-      <w:proofErr w:type="spellStart"/>
-      <w:r>
-        <w:rPr>
-          <w:sz w:val="21"/>
-          <w:szCs w:val="21"/>
-        </w:rPr>
-        <w:t>XGBoost</w:t>
-      </w:r>
-      <w:proofErr w:type="spellEnd"/>
-      <w:r>
-        <w:rPr>
-          <w:sz w:val="21"/>
-          <w:szCs w:val="21"/>
-        </w:rPr>
-        <w:t xml:space="preserve"> after it achieved 3.23 min MAE (0.11 std dev) — a 63.3% reduction vs. the training-average baseline, more than double the required 30% threshold.</w:t>
+        <w:t xml:space="preserve">-  Benchmarked Random Forest against XGBoost using 5-fold cross-validation on 8,000 historical orders; selected XGBoost after it achieved 3.23 min MAE (0.11 std dev) </w:t>
+      </w:r>
+      <w:r>
+        <w:rPr>
+          <w:sz w:val="21"/>
+          <w:szCs w:val="21"/>
+        </w:rPr>
+        <w:t xml:space="preserve">- </w:t>
+      </w:r>
+      <w:r>
+        <w:rPr>
+          <w:sz w:val="21"/>
+          <w:szCs w:val="21"/>
+        </w:rPr>
+        <w:t>a 63.3% reduction vs. the training-average baseline, more than double the required 30% threshold.</w:t>
       </w:r>
     </w:p>
     <w:p>
@@ -1386,29 +1208,134 @@
         <w:spacing w:after="80"/>
         <w:ind w:left="360" w:hanging="180"/>
         <w:jc w:val="both"/>
-      </w:pPr>
-      <w:r>
-        <w:rPr>
-          <w:sz w:val="21"/>
-          <w:szCs w:val="21"/>
-        </w:rPr>
-        <w:t xml:space="preserve">-  Tools: Python, </w:t>
-      </w:r>
-      <w:proofErr w:type="spellStart"/>
-      <w:r>
-        <w:rPr>
-          <w:sz w:val="21"/>
-          <w:szCs w:val="21"/>
-        </w:rPr>
-        <w:t>XGBoost</w:t>
-      </w:r>
-      <w:proofErr w:type="spellEnd"/>
-      <w:r>
-        <w:rPr>
-          <w:sz w:val="21"/>
-          <w:szCs w:val="21"/>
-        </w:rPr>
-        <w:t>, Random Forest, scikit-learn, feature engineering, cross-validation.</w:t>
+        <w:rPr>
+          <w:sz w:val="21"/>
+          <w:szCs w:val="21"/>
+        </w:rPr>
+      </w:pPr>
+      <w:r>
+        <w:rPr>
+          <w:sz w:val="21"/>
+          <w:szCs w:val="21"/>
+        </w:rPr>
+        <w:t>-  Tools: Python, XGBoost, Random Forest, scikit-learn, feature engineering, cross-validation.</w:t>
+      </w:r>
+    </w:p>
+    <w:p>
+      <w:pPr>
+        <w:spacing w:after="40"/>
+        <w:jc w:val="both"/>
+        <w:rPr>
+          <w:sz w:val="21"/>
+          <w:szCs w:val="21"/>
+        </w:rPr>
+      </w:pPr>
+      <w:r>
+        <w:rPr>
+          <w:b/>
+          <w:sz w:val="21"/>
+          <w:szCs w:val="21"/>
+        </w:rPr>
+        <w:t>Etsy Checkout Redesign A/B Test &amp; Multi-Segment Launch Strategy</w:t>
+      </w:r>
+    </w:p>
+    <w:p>
+      <w:pPr>
+        <w:spacing w:after="20"/>
+        <w:ind w:left="200" w:hanging="160"/>
+        <w:jc w:val="both"/>
+        <w:rPr>
+          <w:sz w:val="21"/>
+          <w:szCs w:val="21"/>
+        </w:rPr>
+      </w:pPr>
+      <w:r>
+        <w:t>-</w:t>
+      </w:r>
+      <w:r>
+        <w:t xml:space="preserve"> </w:t>
+      </w:r>
+      <w:r>
+        <w:rPr>
+          <w:sz w:val="21"/>
+          <w:szCs w:val="21"/>
+        </w:rPr>
+        <w:t>Analysed 31K+ experiment logs, completed data-integrity checks, and verified balanced treatment/control assignment using a chi-square test (p = 0.421).</w:t>
+      </w:r>
+    </w:p>
+    <w:p>
+      <w:pPr>
+        <w:spacing w:after="20"/>
+        <w:ind w:left="200" w:hanging="160"/>
+        <w:jc w:val="both"/>
+        <w:rPr>
+          <w:sz w:val="21"/>
+          <w:szCs w:val="21"/>
+        </w:rPr>
+      </w:pPr>
+      <w:r>
+        <w:rPr>
+          <w:sz w:val="21"/>
+          <w:szCs w:val="21"/>
+        </w:rPr>
+        <w:t>-</w:t>
+      </w:r>
+      <w:r>
+        <w:rPr>
+          <w:sz w:val="21"/>
+          <w:szCs w:val="21"/>
+        </w:rPr>
+        <w:t xml:space="preserve"> Evaluated conversion, AOV, and revenue per user with proportion tests, Welch’s t-tests, and Benjamini–Hochberg corrections.</w:t>
+      </w:r>
+    </w:p>
+    <w:p>
+      <w:pPr>
+        <w:spacing w:after="20"/>
+        <w:ind w:left="200" w:hanging="160"/>
+        <w:jc w:val="both"/>
+        <w:rPr>
+          <w:sz w:val="21"/>
+          <w:szCs w:val="21"/>
+        </w:rPr>
+      </w:pPr>
+      <w:r>
+        <w:rPr>
+          <w:sz w:val="21"/>
+          <w:szCs w:val="21"/>
+        </w:rPr>
+        <w:t>-</w:t>
+      </w:r>
+      <w:r>
+        <w:rPr>
+          <w:sz w:val="21"/>
+          <w:szCs w:val="21"/>
+        </w:rPr>
+        <w:t xml:space="preserve"> Found a +34.3% desktop conversion lift but a −23.0% mobile decline; recommended a desktop-only phased rollout projected to generate +$28,455 monthly incremental revenue.</w:t>
+      </w:r>
+    </w:p>
+    <w:p>
+      <w:pPr>
+        <w:spacing w:after="20"/>
+        <w:ind w:left="200" w:hanging="160"/>
+        <w:jc w:val="both"/>
+        <w:rPr>
+          <w:sz w:val="21"/>
+          <w:szCs w:val="21"/>
+        </w:rPr>
+      </w:pPr>
+      <w:r>
+        <w:rPr>
+          <w:sz w:val="21"/>
+          <w:szCs w:val="21"/>
+        </w:rPr>
+        <w:t>-</w:t>
+      </w:r>
+      <w:r>
+        <w:rPr>
+          <w:sz w:val="21"/>
+          <w:szCs w:val="21"/>
+        </w:rPr>
+        <w:t xml:space="preserve"> Tools: Python, pandas, NumPy, SciPy, Statsmodels, Matplotlib, Seaborn, A/B testing.</w:t>
       </w:r>
     </w:p>
     <w:p>
@@ -1451,55 +1378,7 @@
           <w:sz w:val="21"/>
           <w:szCs w:val="21"/>
         </w:rPr>
-        <w:t xml:space="preserve">-  Delivered a regression pipeline that identified </w:t>
-      </w:r>
-      <w:proofErr w:type="spellStart"/>
-      <w:r>
-        <w:rPr>
-          <w:sz w:val="21"/>
-          <w:szCs w:val="21"/>
-        </w:rPr>
-        <w:t>OverallQual</w:t>
-      </w:r>
-      <w:proofErr w:type="spellEnd"/>
-      <w:r>
-        <w:rPr>
-          <w:sz w:val="21"/>
-          <w:szCs w:val="21"/>
-        </w:rPr>
-        <w:t xml:space="preserve"> and </w:t>
-      </w:r>
-      <w:proofErr w:type="spellStart"/>
-      <w:r>
-        <w:rPr>
-          <w:sz w:val="21"/>
-          <w:szCs w:val="21"/>
-        </w:rPr>
-        <w:t>GrLivArea</w:t>
-      </w:r>
-      <w:proofErr w:type="spellEnd"/>
-      <w:r>
-        <w:rPr>
-          <w:sz w:val="21"/>
-          <w:szCs w:val="21"/>
-        </w:rPr>
-        <w:t xml:space="preserve"> as the most predictive features in </w:t>
-      </w:r>
-      <w:proofErr w:type="gramStart"/>
-      <w:r>
-        <w:rPr>
-          <w:sz w:val="21"/>
-          <w:szCs w:val="21"/>
-        </w:rPr>
-        <w:t>Ames</w:t>
-      </w:r>
-      <w:proofErr w:type="gramEnd"/>
-      <w:r>
-        <w:rPr>
-          <w:sz w:val="21"/>
-          <w:szCs w:val="21"/>
-        </w:rPr>
-        <w:t xml:space="preserve"> housing prices.</w:t>
+        <w:t>-  Delivered a regression pipeline that identified OverallQual and GrLivArea as the most predictive features in Ames housing prices.</w:t>
       </w:r>
     </w:p>
     <w:p>
@@ -1619,23 +1498,7 @@
           <w:sz w:val="21"/>
           <w:szCs w:val="21"/>
         </w:rPr>
-        <w:t>-  Presented "Anti-Sleep Sensing and Auto Parking System using Machine Learning" at the 6th International Conference on Innovative Computing (</w:t>
-      </w:r>
-      <w:proofErr w:type="spellStart"/>
-      <w:r>
-        <w:rPr>
-          <w:sz w:val="21"/>
-          <w:szCs w:val="21"/>
-        </w:rPr>
-        <w:t>IConIC</w:t>
-      </w:r>
-      <w:proofErr w:type="spellEnd"/>
-      <w:r>
-        <w:rPr>
-          <w:sz w:val="21"/>
-          <w:szCs w:val="21"/>
-        </w:rPr>
-        <w:t>), Panimalar Engineering College, April 2023.</w:t>
+        <w:t>-  Presented "Anti-Sleep Sensing and Auto Parking System using Machine Learning" at the 6th International Conference on Innovative Computing (IConIC), Panimalar Engineering College, April 2023.</w:t>
       </w:r>
     </w:p>
     <w:p>
@@ -1650,21 +1513,53 @@
           <w:sz w:val="21"/>
           <w:szCs w:val="21"/>
         </w:rPr>
-        <w:t>Government of India Copyright — Registration No. L-147491/2024</w:t>
-      </w:r>
-    </w:p>
-    <w:p>
-      <w:pPr>
-        <w:spacing w:after="80"/>
-        <w:ind w:left="360" w:hanging="180"/>
-        <w:jc w:val="both"/>
-      </w:pPr>
-      <w:r>
-        <w:rPr>
-          <w:sz w:val="21"/>
-          <w:szCs w:val="21"/>
-        </w:rPr>
-        <w:t>-  Co-author: "Development of an AI-Driven System for Predictive Analysis and Optimisation of Biodegradable Material Production for 3D Printed Medical Implants" — at the intersection of AI, ML, 3D printing, and biomedical engineering.</w:t>
+        <w:t xml:space="preserve">Government of India Copyright </w:t>
+      </w:r>
+      <w:r>
+        <w:rPr>
+          <w:b/>
+          <w:bCs/>
+          <w:sz w:val="21"/>
+          <w:szCs w:val="21"/>
+        </w:rPr>
+        <w:t xml:space="preserve">- </w:t>
+      </w:r>
+      <w:r>
+        <w:rPr>
+          <w:b/>
+          <w:bCs/>
+          <w:sz w:val="21"/>
+          <w:szCs w:val="21"/>
+        </w:rPr>
+        <w:t>Registration No. L-147491/2024</w:t>
+      </w:r>
+    </w:p>
+    <w:p>
+      <w:pPr>
+        <w:spacing w:after="80"/>
+        <w:ind w:left="360" w:hanging="180"/>
+        <w:jc w:val="both"/>
+      </w:pPr>
+      <w:r>
+        <w:rPr>
+          <w:sz w:val="21"/>
+          <w:szCs w:val="21"/>
+        </w:rPr>
+        <w:t xml:space="preserve">-  Co-author: "Development of an AI-Driven System for Predictive Analysis and Optimisation of Biodegradable Material Production for 3D Printed Medical Implants" </w:t>
+      </w:r>
+      <w:r>
+        <w:rPr>
+          <w:sz w:val="21"/>
+          <w:szCs w:val="21"/>
+        </w:rPr>
+        <w:t xml:space="preserve">- </w:t>
+      </w:r>
+      <w:r>
+        <w:rPr>
+          <w:sz w:val="21"/>
+          <w:szCs w:val="21"/>
+        </w:rPr>
+        <w:t>at the intersection of AI, ML, 3D printing, and biomedical engineering.</w:t>
       </w:r>
     </w:p>
     <w:p>
@@ -1679,21 +1574,53 @@
           <w:sz w:val="21"/>
           <w:szCs w:val="21"/>
         </w:rPr>
-        <w:t>Government of India Copyright — Registration No. L-147005/2024</w:t>
-      </w:r>
-    </w:p>
-    <w:p>
-      <w:pPr>
-        <w:spacing w:after="80"/>
-        <w:ind w:left="360" w:hanging="180"/>
-        <w:jc w:val="both"/>
-      </w:pPr>
-      <w:r>
-        <w:rPr>
-          <w:sz w:val="21"/>
-          <w:szCs w:val="21"/>
-        </w:rPr>
-        <w:t>-  Co-author: "Utilizing Fuzzy Logic Frameworks to Eliminate and Reduce Odor in Sanitary Facilities" — IoT and sensor-data application.</w:t>
+        <w:t xml:space="preserve">Government of India Copyright </w:t>
+      </w:r>
+      <w:r>
+        <w:rPr>
+          <w:b/>
+          <w:bCs/>
+          <w:sz w:val="21"/>
+          <w:szCs w:val="21"/>
+        </w:rPr>
+        <w:t xml:space="preserve">- </w:t>
+      </w:r>
+      <w:r>
+        <w:rPr>
+          <w:b/>
+          <w:bCs/>
+          <w:sz w:val="21"/>
+          <w:szCs w:val="21"/>
+        </w:rPr>
+        <w:t>Registration No. L-147005/2024</w:t>
+      </w:r>
+    </w:p>
+    <w:p>
+      <w:pPr>
+        <w:spacing w:after="80"/>
+        <w:ind w:left="360" w:hanging="180"/>
+        <w:jc w:val="both"/>
+      </w:pPr>
+      <w:r>
+        <w:rPr>
+          <w:sz w:val="21"/>
+          <w:szCs w:val="21"/>
+        </w:rPr>
+        <w:t xml:space="preserve">-  Co-author: "Utilizing Fuzzy Logic Frameworks to Eliminate and Reduce Odor in Sanitary Facilities" </w:t>
+      </w:r>
+      <w:r>
+        <w:rPr>
+          <w:sz w:val="21"/>
+          <w:szCs w:val="21"/>
+        </w:rPr>
+        <w:t xml:space="preserve">- </w:t>
+      </w:r>
+      <w:r>
+        <w:rPr>
+          <w:sz w:val="21"/>
+          <w:szCs w:val="21"/>
+        </w:rPr>
+        <w:t>IoT and sensor-data application.</w:t>
       </w:r>
     </w:p>
     <w:p>
@@ -1727,27 +1654,25 @@
           <w:sz w:val="21"/>
           <w:szCs w:val="21"/>
         </w:rPr>
-        <w:t xml:space="preserve">Event Volunteer — </w:t>
-      </w:r>
-      <w:proofErr w:type="spellStart"/>
-      <w:r>
-        <w:rPr>
-          <w:b/>
-          <w:bCs/>
-          <w:sz w:val="21"/>
-          <w:szCs w:val="21"/>
-        </w:rPr>
-        <w:t>IConIC</w:t>
-      </w:r>
-      <w:proofErr w:type="spellEnd"/>
-      <w:r>
-        <w:rPr>
-          <w:b/>
-          <w:bCs/>
-          <w:sz w:val="21"/>
-          <w:szCs w:val="21"/>
-        </w:rPr>
-        <w:t xml:space="preserve"> Conference, Panimalar Engineering College</w:t>
+        <w:t xml:space="preserve">Event Volunteer </w:t>
+      </w:r>
+      <w:r>
+        <w:rPr>
+          <w:b/>
+          <w:bCs/>
+          <w:sz w:val="21"/>
+          <w:szCs w:val="21"/>
+        </w:rPr>
+        <w:t xml:space="preserve">- </w:t>
+      </w:r>
+      <w:r>
+        <w:rPr>
+          <w:b/>
+          <w:bCs/>
+          <w:sz w:val="21"/>
+          <w:szCs w:val="21"/>
+        </w:rPr>
+        <w:t>IConIC Conference, Panimalar Engineering College</w:t>
       </w:r>
       <w:r>
         <w:rPr>
@@ -1768,23 +1693,7 @@
           <w:sz w:val="21"/>
           <w:szCs w:val="21"/>
         </w:rPr>
-        <w:t xml:space="preserve">-  Coordinated participants, faculty, and technical teams across the 6th and 7th editions of </w:t>
-      </w:r>
-      <w:proofErr w:type="spellStart"/>
-      <w:r>
-        <w:rPr>
-          <w:sz w:val="21"/>
-          <w:szCs w:val="21"/>
-        </w:rPr>
-        <w:t>IConIC</w:t>
-      </w:r>
-      <w:proofErr w:type="spellEnd"/>
-      <w:r>
-        <w:rPr>
-          <w:sz w:val="21"/>
-          <w:szCs w:val="21"/>
-        </w:rPr>
-        <w:t>.</w:t>
+        <w:t>-  Coordinated participants, faculty, and technical teams across the 6th and 7th editions of IConIC.</w:t>
       </w:r>
     </w:p>
     <w:p>
@@ -1817,6 +1726,7 @@
           <w:sz w:val="22"/>
           <w:szCs w:val="22"/>
         </w:rPr>
+        <w:lastRenderedPageBreak/>
         <w:t>ACHIEVEMENTS &amp; ACTIVITIES</w:t>
       </w:r>
     </w:p>
@@ -1831,7 +1741,21 @@
           <w:sz w:val="21"/>
           <w:szCs w:val="21"/>
         </w:rPr>
-        <w:t>-  National Hackathon Participant — Hackfest'23, SRMIST (24-hour National Level Hackathon), January 2023.</w:t>
+        <w:t xml:space="preserve">-  National Hackathon Participant </w:t>
+      </w:r>
+      <w:r>
+        <w:rPr>
+          <w:sz w:val="21"/>
+          <w:szCs w:val="21"/>
+        </w:rPr>
+        <w:t xml:space="preserve">- </w:t>
+      </w:r>
+      <w:r>
+        <w:rPr>
+          <w:sz w:val="21"/>
+          <w:szCs w:val="21"/>
+        </w:rPr>
+        <w:t>Hackfest'23, SRMIST (24-hour National Level Hackathon), January 2023.</w:t>
       </w:r>
     </w:p>
     <w:p>
@@ -1892,230 +1816,287 @@
           <w:sz w:val="21"/>
           <w:szCs w:val="21"/>
         </w:rPr>
-        <w:lastRenderedPageBreak/>
-        <w:t xml:space="preserve">-  Associate Data Analyst in SQL (39 hrs) — </w:t>
-      </w:r>
-      <w:proofErr w:type="spellStart"/>
-      <w:r>
-        <w:rPr>
-          <w:sz w:val="21"/>
-          <w:szCs w:val="21"/>
-        </w:rPr>
-        <w:t>DataCamp</w:t>
-      </w:r>
-      <w:proofErr w:type="spellEnd"/>
-      <w:r>
-        <w:rPr>
-          <w:sz w:val="21"/>
-          <w:szCs w:val="21"/>
-        </w:rPr>
-        <w:t>, Apr 2026</w:t>
-      </w:r>
-    </w:p>
-    <w:p>
-      <w:pPr>
-        <w:spacing w:after="80"/>
-        <w:ind w:left="360" w:hanging="180"/>
-        <w:jc w:val="both"/>
-      </w:pPr>
-      <w:r>
-        <w:rPr>
-          <w:sz w:val="21"/>
-          <w:szCs w:val="21"/>
-        </w:rPr>
-        <w:t>-  Data Analytics Job Simulation — Deloitte / Forage, June 2026</w:t>
-      </w:r>
-    </w:p>
-    <w:p>
-      <w:pPr>
-        <w:spacing w:after="80"/>
-        <w:ind w:left="360" w:hanging="180"/>
-        <w:jc w:val="both"/>
-      </w:pPr>
-      <w:r>
-        <w:rPr>
-          <w:sz w:val="21"/>
-          <w:szCs w:val="21"/>
-        </w:rPr>
-        <w:t>-  Data Science Job Simulation — British Airways / Forage, May 2026</w:t>
-      </w:r>
-    </w:p>
-    <w:p>
-      <w:pPr>
-        <w:spacing w:after="80"/>
-        <w:ind w:left="360" w:hanging="180"/>
-        <w:jc w:val="both"/>
-      </w:pPr>
-      <w:r>
-        <w:rPr>
-          <w:sz w:val="21"/>
-          <w:szCs w:val="21"/>
-        </w:rPr>
-        <w:t>-  Data Science Job Simulation — Lloyds Banking Group / Forage, May 2026</w:t>
-      </w:r>
-    </w:p>
-    <w:p>
-      <w:pPr>
-        <w:spacing w:after="80"/>
-        <w:ind w:left="360" w:hanging="180"/>
-        <w:jc w:val="both"/>
-      </w:pPr>
-      <w:r>
-        <w:rPr>
-          <w:sz w:val="21"/>
-          <w:szCs w:val="21"/>
-        </w:rPr>
-        <w:t>-  Data Analysis with Python — IBM Cognitive Class, July 2024</w:t>
-      </w:r>
-    </w:p>
-    <w:p>
-      <w:pPr>
-        <w:spacing w:after="80"/>
-        <w:ind w:left="360" w:hanging="180"/>
-        <w:jc w:val="both"/>
-      </w:pPr>
-      <w:r>
-        <w:rPr>
-          <w:sz w:val="21"/>
-          <w:szCs w:val="21"/>
-        </w:rPr>
-        <w:t xml:space="preserve">-  Data Analyst in Power BI (Career Track, 50 hrs) — </w:t>
-      </w:r>
-      <w:proofErr w:type="spellStart"/>
-      <w:r>
-        <w:rPr>
-          <w:sz w:val="21"/>
-          <w:szCs w:val="21"/>
-        </w:rPr>
-        <w:t>DataCamp</w:t>
-      </w:r>
-      <w:proofErr w:type="spellEnd"/>
-      <w:r>
-        <w:rPr>
-          <w:sz w:val="21"/>
-          <w:szCs w:val="21"/>
-        </w:rPr>
-        <w:t>, Sep 2026 — covers Introduction to Power BI, Introduction to DAX, Data Visualization, Customer Churn Case Study, Data Preparation, Data Transformation, Data Modelling (incl. Intermediate), HR Analytics Case Study, DAX Functions (incl. Intermediate), Exploratory Data Analysis, Trend Analysis, Reports, Report Design, Data Connections, and Deploying &amp; Maintaining Assets in Power BI</w:t>
-      </w:r>
-    </w:p>
-    <w:p>
-      <w:pPr>
-        <w:spacing w:after="80"/>
-        <w:ind w:left="360" w:hanging="180"/>
-        <w:jc w:val="both"/>
-      </w:pPr>
-      <w:r>
-        <w:rPr>
-          <w:sz w:val="21"/>
-          <w:szCs w:val="21"/>
-        </w:rPr>
-        <w:t xml:space="preserve">-  Data Manipulation in KNIME — </w:t>
-      </w:r>
-      <w:proofErr w:type="spellStart"/>
-      <w:r>
-        <w:rPr>
-          <w:sz w:val="21"/>
-          <w:szCs w:val="21"/>
-        </w:rPr>
-        <w:t>DataCamp</w:t>
-      </w:r>
-      <w:proofErr w:type="spellEnd"/>
-      <w:r>
-        <w:rPr>
-          <w:sz w:val="21"/>
-          <w:szCs w:val="21"/>
-        </w:rPr>
-        <w:t>, Feb 2026</w:t>
-      </w:r>
-    </w:p>
-    <w:p>
-      <w:pPr>
-        <w:spacing w:after="80"/>
-        <w:ind w:left="360" w:hanging="180"/>
-        <w:jc w:val="both"/>
-      </w:pPr>
-      <w:r>
-        <w:rPr>
-          <w:sz w:val="21"/>
-          <w:szCs w:val="21"/>
-        </w:rPr>
-        <w:t xml:space="preserve">-  Data Transformation in KNIME — </w:t>
-      </w:r>
-      <w:proofErr w:type="spellStart"/>
-      <w:r>
-        <w:rPr>
-          <w:sz w:val="21"/>
-          <w:szCs w:val="21"/>
-        </w:rPr>
-        <w:t>DataCamp</w:t>
-      </w:r>
-      <w:proofErr w:type="spellEnd"/>
-      <w:r>
-        <w:rPr>
-          <w:sz w:val="21"/>
-          <w:szCs w:val="21"/>
-        </w:rPr>
-        <w:t>, Feb 2026</w:t>
-      </w:r>
-    </w:p>
-    <w:p>
-      <w:pPr>
-        <w:spacing w:after="80"/>
-        <w:ind w:left="360" w:hanging="180"/>
-        <w:jc w:val="both"/>
-      </w:pPr>
-      <w:r>
-        <w:rPr>
-          <w:sz w:val="21"/>
-          <w:szCs w:val="21"/>
-        </w:rPr>
-        <w:t xml:space="preserve">-  Data Visualization in KNIME — </w:t>
-      </w:r>
-      <w:proofErr w:type="spellStart"/>
-      <w:r>
-        <w:rPr>
-          <w:sz w:val="21"/>
-          <w:szCs w:val="21"/>
-        </w:rPr>
-        <w:t>DataCamp</w:t>
-      </w:r>
-      <w:proofErr w:type="spellEnd"/>
-      <w:r>
-        <w:rPr>
-          <w:sz w:val="21"/>
-          <w:szCs w:val="21"/>
-        </w:rPr>
-        <w:t>, Mar 2026</w:t>
-      </w:r>
-    </w:p>
-    <w:p>
-      <w:pPr>
-        <w:spacing w:after="80"/>
-        <w:ind w:left="360" w:hanging="180"/>
-        <w:jc w:val="both"/>
-      </w:pPr>
-      <w:r>
-        <w:rPr>
-          <w:sz w:val="21"/>
-          <w:szCs w:val="21"/>
-        </w:rPr>
-        <w:t xml:space="preserve">-  Introduction to Python — </w:t>
-      </w:r>
-      <w:proofErr w:type="spellStart"/>
-      <w:r>
-        <w:rPr>
-          <w:sz w:val="21"/>
-          <w:szCs w:val="21"/>
-        </w:rPr>
-        <w:t>DataCamp</w:t>
-      </w:r>
-      <w:proofErr w:type="spellEnd"/>
-      <w:r>
-        <w:rPr>
-          <w:sz w:val="21"/>
-          <w:szCs w:val="21"/>
-        </w:rPr>
-        <w:t>, Feb 2026</w:t>
+        <w:t xml:space="preserve">-  Associate Data Analyst in SQL (39 hrs) </w:t>
+      </w:r>
+      <w:r>
+        <w:rPr>
+          <w:sz w:val="21"/>
+          <w:szCs w:val="21"/>
+        </w:rPr>
+        <w:t xml:space="preserve">- </w:t>
+      </w:r>
+      <w:r>
+        <w:rPr>
+          <w:sz w:val="21"/>
+          <w:szCs w:val="21"/>
+        </w:rPr>
+        <w:t>DataCamp, Apr 2026</w:t>
+      </w:r>
+    </w:p>
+    <w:p>
+      <w:pPr>
+        <w:spacing w:after="80"/>
+        <w:ind w:left="360" w:hanging="180"/>
+        <w:jc w:val="both"/>
+      </w:pPr>
+      <w:r>
+        <w:rPr>
+          <w:sz w:val="21"/>
+          <w:szCs w:val="21"/>
+        </w:rPr>
+        <w:t xml:space="preserve">-  Data Analytics Job Simulation </w:t>
+      </w:r>
+      <w:r>
+        <w:rPr>
+          <w:sz w:val="21"/>
+          <w:szCs w:val="21"/>
+        </w:rPr>
+        <w:t xml:space="preserve">- </w:t>
+      </w:r>
+      <w:r>
+        <w:rPr>
+          <w:sz w:val="21"/>
+          <w:szCs w:val="21"/>
+        </w:rPr>
+        <w:t>Deloitte / Forage, June 2026</w:t>
+      </w:r>
+    </w:p>
+    <w:p>
+      <w:pPr>
+        <w:spacing w:after="80"/>
+        <w:ind w:left="360" w:hanging="180"/>
+        <w:jc w:val="both"/>
+      </w:pPr>
+      <w:r>
+        <w:rPr>
+          <w:sz w:val="21"/>
+          <w:szCs w:val="21"/>
+        </w:rPr>
+        <w:t xml:space="preserve">-  Data Science Job Simulation </w:t>
+      </w:r>
+      <w:r>
+        <w:rPr>
+          <w:sz w:val="21"/>
+          <w:szCs w:val="21"/>
+        </w:rPr>
+        <w:t xml:space="preserve">- </w:t>
+      </w:r>
+      <w:r>
+        <w:rPr>
+          <w:sz w:val="21"/>
+          <w:szCs w:val="21"/>
+        </w:rPr>
+        <w:t>British Airways / Forage, May 2026</w:t>
+      </w:r>
+    </w:p>
+    <w:p>
+      <w:pPr>
+        <w:spacing w:after="80"/>
+        <w:ind w:left="360" w:hanging="180"/>
+        <w:jc w:val="both"/>
+      </w:pPr>
+      <w:r>
+        <w:rPr>
+          <w:sz w:val="21"/>
+          <w:szCs w:val="21"/>
+        </w:rPr>
+        <w:t xml:space="preserve">-  Data Science Job Simulation </w:t>
+      </w:r>
+      <w:r>
+        <w:rPr>
+          <w:sz w:val="21"/>
+          <w:szCs w:val="21"/>
+        </w:rPr>
+        <w:t xml:space="preserve">- </w:t>
+      </w:r>
+      <w:r>
+        <w:rPr>
+          <w:sz w:val="21"/>
+          <w:szCs w:val="21"/>
+        </w:rPr>
+        <w:t>Lloyds Banking Group / Forage, May 2026</w:t>
+      </w:r>
+    </w:p>
+    <w:p>
+      <w:pPr>
+        <w:spacing w:after="80"/>
+        <w:ind w:left="360" w:hanging="180"/>
+        <w:jc w:val="both"/>
+      </w:pPr>
+      <w:r>
+        <w:rPr>
+          <w:sz w:val="21"/>
+          <w:szCs w:val="21"/>
+        </w:rPr>
+        <w:t xml:space="preserve">-  Data Analysis with Python </w:t>
+      </w:r>
+      <w:r>
+        <w:rPr>
+          <w:sz w:val="21"/>
+          <w:szCs w:val="21"/>
+        </w:rPr>
+        <w:t xml:space="preserve">- </w:t>
+      </w:r>
+      <w:r>
+        <w:rPr>
+          <w:sz w:val="21"/>
+          <w:szCs w:val="21"/>
+        </w:rPr>
+        <w:t>IBM Cognitive Class, July 2024</w:t>
+      </w:r>
+    </w:p>
+    <w:p>
+      <w:pPr>
+        <w:spacing w:after="80"/>
+        <w:ind w:left="360" w:hanging="180"/>
+        <w:jc w:val="both"/>
+      </w:pPr>
+      <w:r>
+        <w:rPr>
+          <w:sz w:val="21"/>
+          <w:szCs w:val="21"/>
+        </w:rPr>
+        <w:t xml:space="preserve">-  Data Analyst in Power BI (Career Track, 50 hrs) </w:t>
+      </w:r>
+      <w:r>
+        <w:rPr>
+          <w:sz w:val="21"/>
+          <w:szCs w:val="21"/>
+        </w:rPr>
+        <w:t xml:space="preserve">- </w:t>
+      </w:r>
+      <w:r>
+        <w:rPr>
+          <w:sz w:val="21"/>
+          <w:szCs w:val="21"/>
+        </w:rPr>
+        <w:t xml:space="preserve">DataCamp, Sep 2026 </w:t>
+      </w:r>
+      <w:r>
+        <w:rPr>
+          <w:sz w:val="21"/>
+          <w:szCs w:val="21"/>
+        </w:rPr>
+        <w:t xml:space="preserve">- </w:t>
+      </w:r>
+      <w:r>
+        <w:rPr>
+          <w:sz w:val="21"/>
+          <w:szCs w:val="21"/>
+        </w:rPr>
+        <w:t>covers Introduction to Power BI, Introduction to DAX, Data Visualization, Customer Churn Case Study, Data Preparation, Data Transformation, Data Modelling (incl. Intermediate), HR Analytics Case Study, DAX Functions (incl. Intermediate), Exploratory Data Analysis, Trend Analysis, Reports, Report Design, Data Connections, and Deploying &amp; Maintaining Assets in Power BI</w:t>
+      </w:r>
+    </w:p>
+    <w:p>
+      <w:pPr>
+        <w:spacing w:after="80"/>
+        <w:ind w:left="360" w:hanging="180"/>
+        <w:jc w:val="both"/>
+      </w:pPr>
+      <w:r>
+        <w:rPr>
+          <w:sz w:val="21"/>
+          <w:szCs w:val="21"/>
+        </w:rPr>
+        <w:t xml:space="preserve">-  Data Manipulation in KNIME </w:t>
+      </w:r>
+      <w:r>
+        <w:rPr>
+          <w:sz w:val="21"/>
+          <w:szCs w:val="21"/>
+        </w:rPr>
+        <w:t xml:space="preserve">- </w:t>
+      </w:r>
+      <w:r>
+        <w:rPr>
+          <w:sz w:val="21"/>
+          <w:szCs w:val="21"/>
+        </w:rPr>
+        <w:t>DataCamp, Feb 2026</w:t>
+      </w:r>
+    </w:p>
+    <w:p>
+      <w:pPr>
+        <w:spacing w:after="80"/>
+        <w:ind w:left="360" w:hanging="180"/>
+        <w:jc w:val="both"/>
+      </w:pPr>
+      <w:r>
+        <w:rPr>
+          <w:sz w:val="21"/>
+          <w:szCs w:val="21"/>
+        </w:rPr>
+        <w:t xml:space="preserve">-  Data Transformation in KNIME </w:t>
+      </w:r>
+      <w:r>
+        <w:rPr>
+          <w:sz w:val="21"/>
+          <w:szCs w:val="21"/>
+        </w:rPr>
+        <w:t xml:space="preserve">- </w:t>
+      </w:r>
+      <w:r>
+        <w:rPr>
+          <w:sz w:val="21"/>
+          <w:szCs w:val="21"/>
+        </w:rPr>
+        <w:t>DataCamp, Feb 2026</w:t>
+      </w:r>
+    </w:p>
+    <w:p>
+      <w:pPr>
+        <w:spacing w:after="80"/>
+        <w:ind w:left="360" w:hanging="180"/>
+        <w:jc w:val="both"/>
+      </w:pPr>
+      <w:r>
+        <w:rPr>
+          <w:sz w:val="21"/>
+          <w:szCs w:val="21"/>
+        </w:rPr>
+        <w:t xml:space="preserve">-  Data Visualization in KNIME </w:t>
+      </w:r>
+      <w:r>
+        <w:rPr>
+          <w:sz w:val="21"/>
+          <w:szCs w:val="21"/>
+        </w:rPr>
+        <w:t xml:space="preserve">- </w:t>
+      </w:r>
+      <w:r>
+        <w:rPr>
+          <w:sz w:val="21"/>
+          <w:szCs w:val="21"/>
+        </w:rPr>
+        <w:t>DataCamp, Mar 2026</w:t>
+      </w:r>
+    </w:p>
+    <w:p>
+      <w:pPr>
+        <w:spacing w:after="80"/>
+        <w:ind w:left="360" w:hanging="180"/>
+        <w:jc w:val="both"/>
+      </w:pPr>
+      <w:r>
+        <w:rPr>
+          <w:sz w:val="21"/>
+          <w:szCs w:val="21"/>
+        </w:rPr>
+        <w:t xml:space="preserve">-  Introduction to Python </w:t>
+      </w:r>
+      <w:r>
+        <w:rPr>
+          <w:sz w:val="21"/>
+          <w:szCs w:val="21"/>
+        </w:rPr>
+        <w:t xml:space="preserve">- </w:t>
+      </w:r>
+      <w:r>
+        <w:rPr>
+          <w:sz w:val="21"/>
+          <w:szCs w:val="21"/>
+        </w:rPr>
+        <w:t>DataCamp, Feb 2026</w:t>
       </w:r>
     </w:p>
     <w:sectPr>

</xml_diff>